<commit_message>
Lab 7 - old
Lab 7 - old
</commit_message>
<xml_diff>
--- a/Assigment/Lab7_old/Lab7_Phuong Nguyen.docx
+++ b/Assigment/Lab7_old/Lab7_Phuong Nguyen.docx
@@ -111,19 +111,19 @@
         <w:spacing w:after="0" w:line="240" w:lineRule="auto"/>
         <w:rPr>
           <w:rFonts w:asciiTheme="majorHAnsi" w:eastAsia="Times New Roman" w:hAnsiTheme="majorHAnsi" w:cs="Arial"/>
-          <w:color w:val="000000"/>
-          <w:kern w:val="0"/>
-          <w14:ligatures w14:val="none"/>
-        </w:rPr>
-      </w:pPr>
-      <w:r>
-        <w:rPr>
-          <w:rFonts w:asciiTheme="majorHAnsi" w:eastAsia="Times New Roman" w:hAnsiTheme="majorHAnsi" w:cs="Arial"/>
-          <w:color w:val="000000"/>
-          <w:kern w:val="0"/>
-          <w14:ligatures w14:val="none"/>
-        </w:rPr>
-        <w:t>BBBBBBBB</w:t>
+          <w:color w:val="EE0000"/>
+          <w:kern w:val="0"/>
+          <w14:ligatures w14:val="none"/>
+        </w:rPr>
+      </w:pPr>
+      <w:r>
+        <w:rPr>
+          <w:rFonts w:asciiTheme="majorHAnsi" w:eastAsia="Times New Roman" w:hAnsiTheme="majorHAnsi" w:cs="Arial"/>
+          <w:color w:val="EE0000"/>
+          <w:kern w:val="0"/>
+          <w14:ligatures w14:val="none"/>
+        </w:rPr>
+        <w:t>BBBBBBB</w:t>
       </w:r>
     </w:p>
     <w:p>
@@ -136,19 +136,19 @@
         <w:spacing w:after="0" w:line="240" w:lineRule="auto"/>
         <w:rPr>
           <w:rFonts w:asciiTheme="majorHAnsi" w:eastAsia="Times New Roman" w:hAnsiTheme="majorHAnsi" w:cs="Arial"/>
-          <w:color w:val="000000"/>
-          <w:kern w:val="0"/>
-          <w14:ligatures w14:val="none"/>
-        </w:rPr>
-      </w:pPr>
-      <w:r>
-        <w:rPr>
-          <w:rFonts w:asciiTheme="majorHAnsi" w:eastAsia="Times New Roman" w:hAnsiTheme="majorHAnsi" w:cs="Arial"/>
-          <w:color w:val="000000"/>
-          <w:kern w:val="0"/>
-          <w14:ligatures w14:val="none"/>
-        </w:rPr>
-        <w:t>CCCCCCCC</w:t>
+          <w:color w:val="EE0000"/>
+          <w:kern w:val="0"/>
+          <w14:ligatures w14:val="none"/>
+        </w:rPr>
+      </w:pPr>
+      <w:r>
+        <w:rPr>
+          <w:rFonts w:asciiTheme="majorHAnsi" w:eastAsia="Times New Roman" w:hAnsiTheme="majorHAnsi" w:cs="Arial"/>
+          <w:color w:val="EE0000"/>
+          <w:kern w:val="0"/>
+          <w14:ligatures w14:val="none"/>
+        </w:rPr>
+        <w:t>CCCCCC</w:t>
       </w:r>
     </w:p>
     <w:p>
@@ -161,19 +161,19 @@
         <w:spacing w:after="0" w:line="240" w:lineRule="auto"/>
         <w:rPr>
           <w:rFonts w:asciiTheme="majorHAnsi" w:eastAsia="Times New Roman" w:hAnsiTheme="majorHAnsi" w:cs="Arial"/>
-          <w:color w:val="000000"/>
-          <w:kern w:val="0"/>
-          <w14:ligatures w14:val="none"/>
-        </w:rPr>
-      </w:pPr>
-      <w:r>
-        <w:rPr>
-          <w:rFonts w:asciiTheme="majorHAnsi" w:eastAsia="Times New Roman" w:hAnsiTheme="majorHAnsi" w:cs="Arial"/>
-          <w:color w:val="000000"/>
-          <w:kern w:val="0"/>
-          <w14:ligatures w14:val="none"/>
-        </w:rPr>
-        <w:t>DDDDDDDDD</w:t>
+          <w:color w:val="EE0000"/>
+          <w:kern w:val="0"/>
+          <w14:ligatures w14:val="none"/>
+        </w:rPr>
+      </w:pPr>
+      <w:r>
+        <w:rPr>
+          <w:rFonts w:asciiTheme="majorHAnsi" w:eastAsia="Times New Roman" w:hAnsiTheme="majorHAnsi" w:cs="Arial"/>
+          <w:color w:val="EE0000"/>
+          <w:kern w:val="0"/>
+          <w14:ligatures w14:val="none"/>
+        </w:rPr>
+        <w:t>DDDDDD</w:t>
       </w:r>
     </w:p>
     <w:p>
@@ -491,15 +491,15 @@
         <w:spacing w:after="0" w:line="240" w:lineRule="auto"/>
         <w:rPr>
           <w:rFonts w:asciiTheme="majorHAnsi" w:eastAsia="Times New Roman" w:hAnsiTheme="majorHAnsi" w:cs="Arial"/>
-          <w:color w:val="000000"/>
-          <w:kern w:val="0"/>
-          <w14:ligatures w14:val="none"/>
-        </w:rPr>
-      </w:pPr>
-      <w:r>
-        <w:rPr>
-          <w:rFonts w:asciiTheme="majorHAnsi" w:eastAsia="Times New Roman" w:hAnsiTheme="majorHAnsi" w:cs="Arial"/>
-          <w:color w:val="000000"/>
+          <w:color w:val="EE0000"/>
+          <w:kern w:val="0"/>
+          <w14:ligatures w14:val="none"/>
+        </w:rPr>
+      </w:pPr>
+      <w:r>
+        <w:rPr>
+          <w:rFonts w:asciiTheme="majorHAnsi" w:eastAsia="Times New Roman" w:hAnsiTheme="majorHAnsi" w:cs="Arial"/>
+          <w:color w:val="EE0000"/>
           <w:kern w:val="0"/>
           <w14:ligatures w14:val="none"/>
         </w:rPr>
@@ -516,19 +516,19 @@
         <w:spacing w:after="0" w:line="240" w:lineRule="auto"/>
         <w:rPr>
           <w:rFonts w:asciiTheme="majorHAnsi" w:eastAsia="Times New Roman" w:hAnsiTheme="majorHAnsi" w:cs="Arial"/>
-          <w:color w:val="000000"/>
-          <w:kern w:val="0"/>
-          <w14:ligatures w14:val="none"/>
-        </w:rPr>
-      </w:pPr>
-      <w:r>
-        <w:rPr>
-          <w:rFonts w:asciiTheme="majorHAnsi" w:eastAsia="Times New Roman" w:hAnsiTheme="majorHAnsi" w:cs="Arial"/>
-          <w:color w:val="000000"/>
-          <w:kern w:val="0"/>
-          <w14:ligatures w14:val="none"/>
-        </w:rPr>
-        <w:t>Fsd</w:t>
+          <w:color w:val="EE0000"/>
+          <w:kern w:val="0"/>
+          <w14:ligatures w14:val="none"/>
+        </w:rPr>
+      </w:pPr>
+      <w:r>
+        <w:rPr>
+          <w:rFonts w:asciiTheme="majorHAnsi" w:eastAsia="Times New Roman" w:hAnsiTheme="majorHAnsi" w:cs="Arial"/>
+          <w:color w:val="EE0000"/>
+          <w:kern w:val="0"/>
+          <w14:ligatures w14:val="none"/>
+        </w:rPr>
+        <w:t>3333333</w:t>
       </w:r>
     </w:p>
     <w:p>
@@ -553,7 +553,31 @@
           <w:kern w:val="0"/>
           <w14:ligatures w14:val="none"/>
         </w:rPr>
-        <w:t>fsd</w:t>
+        <w:t xml:space="preserve">Source code : </w:t>
+      </w:r>
+      <w:hyperlink r:id="rId7" w:history="1">
+        <w:r>
+          <w:rPr>
+            <w:rStyle w:val="Hyperlink"/>
+            <w:rFonts w:asciiTheme="majorHAnsi" w:eastAsia="Times New Roman" w:hAnsiTheme="majorHAnsi" w:cs="Arial"/>
+            <w:kern w:val="0"/>
+            <w:sz w:val="20"/>
+            <w:szCs w:val="20"/>
+            <w14:ligatures w14:val="none"/>
+          </w:rPr>
+          <w:t>https://github.com/miunthphuong/MPP/tree/main/Assigment/Lab7_old/Lab7_code/Prob4</w:t>
+        </w:r>
+      </w:hyperlink>
+      <w:r>
+        <w:rPr>
+          <w:rFonts w:asciiTheme="majorHAnsi" w:eastAsia="Times New Roman" w:hAnsiTheme="majorHAnsi" w:cs="Arial"/>
+          <w:color w:val="000000"/>
+          <w:kern w:val="0"/>
+          <w:sz w:val="20"/>
+          <w:szCs w:val="20"/>
+          <w14:ligatures w14:val="none"/>
+        </w:rPr>
+        <w:t xml:space="preserve"> </w:t>
       </w:r>
     </w:p>
     <w:p>
@@ -564,9 +588,9 @@
       </w:pPr>
     </w:p>
     <w:sectPr>
-      <w:headerReference w:type="default" r:id="rId7"/>
-      <w:footerReference w:type="even" r:id="rId8"/>
-      <w:footerReference w:type="default" r:id="rId9"/>
+      <w:headerReference w:type="default" r:id="rId8"/>
+      <w:footerReference w:type="even" r:id="rId9"/>
+      <w:footerReference w:type="default" r:id="rId10"/>
       <w:pgSz w:w="12240" w:h="15840"/>
       <w:pgMar w:top="1440" w:right="1440" w:bottom="1440" w:left="1440" w:header="708" w:footer="708" w:gutter="0"/>
       <w:cols w:space="708"/>
@@ -2227,6 +2251,29 @@
     <w:basedOn w:val="DefaultParagraphFont"/>
     <w:rsid w:val="00142647"/>
   </w:style>
+  <w:style w:type="character" w:styleId="Hyperlink">
+    <w:name w:val="Hyperlink"/>
+    <w:basedOn w:val="DefaultParagraphFont"/>
+    <w:uiPriority w:val="99"/>
+    <w:unhideWhenUsed/>
+    <w:rsid w:val="00AB3BE2"/>
+    <w:rPr>
+      <w:color w:val="467886" w:themeColor="hyperlink"/>
+      <w:u w:val="single"/>
+    </w:rPr>
+  </w:style>
+  <w:style w:type="character" w:styleId="UnresolvedMention">
+    <w:name w:val="Unresolved Mention"/>
+    <w:basedOn w:val="DefaultParagraphFont"/>
+    <w:uiPriority w:val="99"/>
+    <w:semiHidden/>
+    <w:unhideWhenUsed/>
+    <w:rsid w:val="00AB3BE2"/>
+    <w:rPr>
+      <w:color w:val="605E5C"/>
+      <w:shd w:val="clear" w:color="auto" w:fill="E1DFDD"/>
+    </w:rPr>
+  </w:style>
 </w:styles>
 </file>
 

</xml_diff>